<commit_message>
chore: sync project data docs and research artifacts
</commit_message>
<xml_diff>
--- a/reports/issues/docx/01_북한핵_정세평가보고서.docx
+++ b/reports/issues/docx/01_북한핵_정세평가보고서.docx
@@ -16,7 +16,7 @@
           <w:sz w:val="17"/>
           <w:rFonts w:ascii="Malgun Gothic" w:eastAsia="Malgun Gothic" w:hAnsi="Malgun Gothic"/>
         </w:rPr>
-        <w:t xml:space="preserve">APPROVED FOR PUBLIC RELEASE BY INTELLIGENCE ASSESSMENT DIRECTORATE on 21 September 2026</w:t>
+        <w:t xml:space="preserve">APPROVED FOR PUBLIC RELEASE BY INTELLIGENCE ASSESSMENT DIRECTORATE on 28 September 2026</w:t>
       </w:r>
     </w:p>
     <w:tbl>
@@ -229,7 +229,7 @@
                 <w:sz w:val="16"/>
                 <w:rFonts w:ascii="Malgun Gothic" w:eastAsia="Malgun Gothic" w:hAnsi="Malgun Gothic"/>
               </w:rPr>
-              <w:t xml:space="preserve">Date: 2026-09-21</w:t>
+              <w:t xml:space="preserve">Date: 2026-09-28</w:t>
             </w:r>
           </w:p>
         </w:tc>
@@ -400,7 +400,7 @@
           <w:sz w:val="18"/>
           <w:rFonts w:ascii="Malgun Gothic" w:eastAsia="Malgun Gothic" w:hAnsi="Malgun Gothic"/>
         </w:rPr>
-        <w:t xml:space="preserve">Synopsis: (U) DOCUMENT SYNOPSIS CREATED ON 2026-09-21 15:56 KST -- SEE STRATEGIC REPOSITORY FOR LIVE DATA</w:t>
+        <w:t xml:space="preserve">Synopsis: (U) DOCUMENT SYNOPSIS CREATED ON 2026-09-28 21:31 KST -- SEE STRATEGIC REPOSITORY FOR LIVE DATA</w:t>
       </w:r>
     </w:p>
     <w:p>
@@ -1537,7 +1537,7 @@
         <w:br/>
         <w:t xml:space="preserve">• 3개 AI 모델 합의도 (Mistral-7B, Qwen2.5-7B, EXAONE-3.5): 미디어 프레이밍 'CRITICAL / CONCERN (위기 고조 / 심각한 우려)' (100.0% (3/3 일치) 일치).</w:t>
         <w:br/>
-        <w:t xml:space="preserve">• Sentinel IFCN 검증 팩트체크: 공식 발표 및 주요 언론 피드 대상 허위·왜곡 정보 0건 확인.</w:t>
+        <w:t xml:space="preserve">• 검증 상태: 확인 필요. 승인된 조기경보 스냅샷과 사람 검수 상태가 연결되기 전에는 Alert Level을 확정하지 않음.</w:t>
         <w:br/>
         <w:t xml:space="preserve"/>
       </w:r>

</xml_diff>